<commit_message>
adicionando resultados de UShap_bimodalidade
</commit_message>
<xml_diff>
--- a/Paper_JEB_Metodos.docx
+++ b/Paper_JEB_Metodos.docx
@@ -80,7 +80,7 @@
           <w:rFonts w:ascii="Bookman Old Style" w:hAnsi="Bookman Old Style" w:cstheme="minorBidi"/>
           <w:sz w:val="22"/>
           <w:szCs w:val="21"/>
-          <w:lang w:val="en-US"/>
+          <w:lang w:val="pt-BR"/>
         </w:rPr>
       </w:pPr>
     </w:p>
@@ -953,7 +953,43 @@
           <w:szCs w:val="21"/>
           <w:lang w:val="en-US"/>
         </w:rPr>
-        <w:t>Specifically, we aim to explore whether each preference function generates a distinct topological signature in the mating network, and how these structural patterns respond to increasing preference heterogeneity. Furthermore, we investigate how these emergent topologies—such as nested hierarchies or modular cliques—mediate the evolutionary trajectory of male traits, either by fueling phenotypic exaggeration or rescuing genetic diversity from extinction. Critically, we also evaluate the sensitivity of these topo-evolutionary pathways to ecological reality: we test whether mate-sampling costs, which restrict female choice, act as ecological noise that dissolves network structure and neutralizes the evolutionary power of sexual selection. Ultimately, our framework seeks to provide a unified perspective in which preference functions, individual behavioural variation, and ecological constraints interact to shape macroevolution through the topology of the sexual network, offering testable predictions for empirical studies across taxa where female sampling capacity varies naturally.</w:t>
+        <w:t>Specifically, we aim to explore whether each preference function generates a distinct topological signature in the mating network, and how these structural patterns respond to increasing preference heterogeneity. Furthermore, we investigate how these emergent topologies</w:t>
+      </w:r>
+      <w:r>
+        <w:rPr>
+          <w:rFonts w:ascii="Bookman Old Style" w:eastAsiaTheme="minorHAnsi" w:hAnsi="Bookman Old Style" w:cstheme="minorBidi"/>
+          <w:sz w:val="22"/>
+          <w:szCs w:val="21"/>
+          <w:lang w:val="en-US"/>
+        </w:rPr>
+        <w:t xml:space="preserve">, </w:t>
+      </w:r>
+      <w:r>
+        <w:rPr>
+          <w:rFonts w:ascii="Bookman Old Style" w:eastAsiaTheme="minorHAnsi" w:hAnsi="Bookman Old Style" w:cstheme="minorBidi"/>
+          <w:sz w:val="22"/>
+          <w:szCs w:val="21"/>
+          <w:lang w:val="en-US"/>
+        </w:rPr>
+        <w:t>such as nested hierarchies or modular cliques</w:t>
+      </w:r>
+      <w:r>
+        <w:rPr>
+          <w:rFonts w:ascii="Bookman Old Style" w:eastAsiaTheme="minorHAnsi" w:hAnsi="Bookman Old Style" w:cstheme="minorBidi"/>
+          <w:sz w:val="22"/>
+          <w:szCs w:val="21"/>
+          <w:lang w:val="en-US"/>
+        </w:rPr>
+        <w:t xml:space="preserve">, </w:t>
+      </w:r>
+      <w:r>
+        <w:rPr>
+          <w:rFonts w:ascii="Bookman Old Style" w:eastAsiaTheme="minorHAnsi" w:hAnsi="Bookman Old Style" w:cstheme="minorBidi"/>
+          <w:sz w:val="22"/>
+          <w:szCs w:val="21"/>
+          <w:lang w:val="en-US"/>
+        </w:rPr>
+        <w:t>mediate the evolutionary trajectory of male traits, either by fueling phenotypic exaggeration or rescuing genetic diversity from extinction. Critically, we also evaluate the sensitivity of these topo-evolutionary pathways to ecological reality: we test whether mate-sampling costs, which restrict female choice, act as ecological noise that dissolves network structure and neutralizes the evolutionary power of sexual selection. Ultimately, our framework seeks to provide a unified perspective in which preference functions, individual behavioural variation, and ecological constraints interact to shape macroevolution through the topology of the sexual network, offering testable predictions for empirical studies across taxa where female sampling capacity varies naturally.</w:t>
       </w:r>
     </w:p>
     <w:p>
@@ -1270,6 +1306,13 @@
           <w:szCs w:val="21"/>
         </w:rPr>
         <w:t xml:space="preserve">. Prior </w:t>
+      </w:r>
+      <w:r>
+        <w:rPr>
+          <w:rFonts w:ascii="Bookman Old Style" w:hAnsi="Bookman Old Style"/>
+          <w:sz w:val="22"/>
+          <w:szCs w:val="21"/>
+        </w:rPr>
         <w:lastRenderedPageBreak/>
         <w:t xml:space="preserve">to mating, males were subject to stabilising natural selection. The viability (survival probability) </w:t>
       </w:r>
@@ -4030,6 +4073,13 @@
           <w:szCs w:val="21"/>
         </w:rPr>
         <w:t xml:space="preserve">Critically, the central tendency of the female preference distribution was held constant across all four preference regimes, with preference thresholds independently </w:t>
+      </w:r>
+      <w:r>
+        <w:rPr>
+          <w:rFonts w:ascii="Bookman Old Style" w:hAnsi="Bookman Old Style"/>
+          <w:sz w:val="22"/>
+          <w:szCs w:val="21"/>
+        </w:rPr>
         <w:lastRenderedPageBreak/>
         <w:t xml:space="preserve">drawn each generation from </w:t>
       </w:r>
@@ -5526,6 +5576,7 @@
           <w:sz w:val="22"/>
           <w:szCs w:val="21"/>
         </w:rPr>
+        <w:lastRenderedPageBreak/>
         <w:t>(4)</w:t>
       </w:r>
       <w:r>
@@ -5786,7 +5837,6 @@
           <w:sz w:val="22"/>
           <w:szCs w:val="21"/>
         </w:rPr>
-        <w:lastRenderedPageBreak/>
         <w:t>centralization</w:t>
       </w:r>
       <w:r>
@@ -6632,9 +6682,8 @@
           <w:sz w:val="22"/>
           <w:szCs w:val="21"/>
         </w:rPr>
-        <w:t xml:space="preserve">P2 — Preference function shape is a fixed property of the mating system. The geometry of how a female translates her internal threshold into a copulation decision — </w:t>
         <w:lastRenderedPageBreak/>
-        <w:t>whether she seeks an exact match (Gaussian), favours increasingly exaggerated traits (sigmoid), avoids the phenotypic mean (U-shaped), or mates at random (uniform) — is treated as a fixed ecological parameter, not an evolving trait. This deliberate simplification isolates the effect of function geometry from preference co-evolution.</w:t>
+        <w:t>P2 — Preference function shape is a fixed property of the mating system. The geometry of how a female translates her internal threshold into a copulation decision — whether she seeks an exact match (Gaussian), favours increasingly exaggerated traits (sigmoid), avoids the phenotypic mean (U-shaped), or mates at random (uniform) — is treated as a fixed ecological parameter, not an evolving trait. This deliberate simplification isolates the effect of function geometry from preference co-evolution.</w:t>
       </w:r>
     </w:p>
     <w:p>
@@ -7510,6 +7559,7 @@
           <w:sz w:val="22"/>
           <w:szCs w:val="21"/>
         </w:rPr>
+        <w:lastRenderedPageBreak/>
         <w:t>What we measure:</w:t>
       </w:r>
       <w:r>
@@ -7705,7 +7755,6 @@
           <w:sz w:val="22"/>
           <w:szCs w:val="21"/>
         </w:rPr>
-        <w:lastRenderedPageBreak/>
         <w:t>H3 — The Ecological Noise Hypothesis</w:t>
       </w:r>
     </w:p>
@@ -10835,7 +10884,16 @@
           <w:sz w:val="22"/>
           <w:szCs w:val="21"/>
         </w:rPr>
-        <w:t>Table 1 summarises the parameters, variables, and probabilistic distributions used throughout our simulations. The simulation framework operates across two distinct temporal scales: (i) an ecological time scale, which resolves the sequential mate assessment and the formation of the static bipartite mating network within a single breeding season, and (ii) an evolutionary time scale, which dictates viability selection, genetic inheritance, and density-dependent juvenile mortality across 100 non-overlapping generations.</w:t>
+        <w:t xml:space="preserve">Table 1 summarises the parameters, variables, and probabilistic distributions used throughout our simulations. The simulation framework operates across two distinct temporal scales: (i) an ecological time scale, which resolves the sequential mate assessment and the formation of the static bipartite mating network within a single </w:t>
+      </w:r>
+      <w:r>
+        <w:rPr>
+          <w:rFonts w:ascii="Bookman Old Style" w:hAnsi="Bookman Old Style"/>
+          <w:sz w:val="22"/>
+          <w:szCs w:val="21"/>
+        </w:rPr>
+        <w:lastRenderedPageBreak/>
+        <w:t>breeding season, and (ii) an evolutionary time scale, which dictates viability selection, genetic inheritance, and density-dependent juvenile mortality across 100 non-overlapping generations.</w:t>
       </w:r>
     </w:p>
     <w:p>
@@ -10856,7 +10914,6 @@
           <w:sz w:val="22"/>
           <w:szCs w:val="21"/>
         </w:rPr>
-        <w:lastRenderedPageBreak/>
         <w:t xml:space="preserve">Table 1. List of symbols and parameters used in the individual-based simulations. </w:t>
       </w:r>
       <w:r>
@@ -15287,6 +15344,14 @@
           <w:lang w:val="pt-BR"/>
         </w:rPr>
         <w:t xml:space="preserve">, com a Disruptiva </w:t>
+      </w:r>
+      <w:r>
+        <w:rPr>
+          <w:rFonts w:ascii="Bookman Old Style" w:hAnsi="Bookman Old Style"/>
+          <w:sz w:val="22"/>
+          <w:szCs w:val="21"/>
+          <w:lang w:val="pt-BR"/>
+        </w:rPr>
         <w:lastRenderedPageBreak/>
         <w:t>operando via atomização fenotípica no regime de baixa heterogeneidade, e a Gaussiana assumindo via fragmentação assortativa no regime de alta heterogeneidade.</w:t>
       </w:r>
@@ -15370,9 +15435,29 @@
           <w:rFonts w:ascii="Bookman Old Style" w:hAnsi="Bookman Old Style"/>
           <w:sz w:val="22"/>
           <w:szCs w:val="21"/>
-          <w:lang w:val="pt-BR"/>
-        </w:rPr>
-        <w:t>(2) Interpret each finding in light of existing theory on genetic diversity and demographic constraint. (3) Compare with prior empirical work on topological/network approaches in evolutionary biology. (4) Address limitations: assumptions of the framework, parameter sensitivity, and scope of generalization. (5) Outline implications for future research and for the broader evolutionary-biology community.]</w:t>
+          <w:lang w:val="en-US"/>
+        </w:rPr>
+        <w:t xml:space="preserve">(2) Interpret each finding </w:t>
+      </w:r>
+      <w:proofErr w:type="gramStart"/>
+      <w:r>
+        <w:rPr>
+          <w:rFonts w:ascii="Bookman Old Style" w:hAnsi="Bookman Old Style"/>
+          <w:sz w:val="22"/>
+          <w:szCs w:val="21"/>
+          <w:lang w:val="en-US"/>
+        </w:rPr>
+        <w:t>in light of</w:t>
+      </w:r>
+      <w:proofErr w:type="gramEnd"/>
+      <w:r>
+        <w:rPr>
+          <w:rFonts w:ascii="Bookman Old Style" w:hAnsi="Bookman Old Style"/>
+          <w:sz w:val="22"/>
+          <w:szCs w:val="21"/>
+          <w:lang w:val="en-US"/>
+        </w:rPr>
+        <w:t xml:space="preserve"> existing theory on genetic diversity and demographic constraint. (3) Compare with prior empirical work on topological/network approaches in evolutionary biology. (4) Address limitations: assumptions of the framework, parameter sensitivity, and scope of generalization. (5) Outline implications for future research and for the broader evolutionary-biology community.]</w:t>
       </w:r>
     </w:p>
     <w:p>
@@ -15400,7 +15485,7 @@
           <w:rFonts w:ascii="Bookman Old Style" w:hAnsi="Bookman Old Style"/>
           <w:sz w:val="22"/>
           <w:szCs w:val="21"/>
-          <w:lang w:val="pt-BR"/>
+          <w:lang w:val="en-US"/>
         </w:rPr>
       </w:pPr>
       <w:r>
@@ -18997,6 +19082,7 @@
   <w:style w:type="character" w:default="1" w:styleId="DefaultParagraphFont">
     <w:name w:val="Default Paragraph Font"/>
     <w:uiPriority w:val="1"/>
+    <w:semiHidden/>
     <w:unhideWhenUsed/>
   </w:style>
   <w:style w:type="table" w:default="1" w:styleId="TableNormal">

</xml_diff>